<commit_message>
Elevate SiM evaluation protocol: missingness mechanisms, adjusted downstream, S9 fragility.
Add explicit MCAR/MAR/spatial definitions with MAR betas, covariate-adjusted Urban coefficients, protocol pillars and application guide, and regenerate manuscript/supplementary tables S9–S10.

Co-authored-by: Cursor <cursoragent@cursor.com>
</commit_message>
<xml_diff>
--- a/public/main.docx
+++ b/public/main.docx
@@ -155,7 +155,7 @@
         <w:spacing w:after="120"/>
       </w:pPr>
       <w:r>
-        <w:t>The present study addresses this gap by proposing a reproducible statistical evaluation protocol for assessing contextual label inference methods, using CHNS as an illustrative testbed. This manuscript extends our prior conference work on inferring urban–rural context from dietary patterns by reframing the contribution for Statistics in Medicine: the focus is a transparent missing-label evaluation protocol (simulated missingness, temporal holdout, comparators, calibration, downstream preservation) rather than a standalone prediction benchmark. Rather than claiming optimal prediction, we establish a multi-dimensional validation framework that includes: (i) simulated missingness at varying rates; (ii) leave-one-year-out temporal generalisability; (iii) distributional fidelity via Jensen–Shannon divergence; (iv) probabilistic calibration assessment; and (v) downstream effect preservation.</w:t>
+        <w:t>We formalise a reusable statistical evaluation protocol for contextual-label imputation with three pillars. Pillar 1 — Simulated missingness for internal validation: when a survey provides complete labels for a reference cohort, labels can be masked under MCAR/MAR/spatially structured mechanisms to stress-test imputation methods before deployment. Pillar 2 — Separate predictive accuracy from downstream inferential preservation: high classification accuracy does not guarantee that exposure contrasts, regression coefficients, or standard errors remain usable for epidemiology. Pillar 3 — Spatiotemporal generalisability: leave-one-year-out and leave-one-province-out holdouts quantify transportability across survey waves and regions. These pillars matter because missing contextual labels threaten both prediction and causal/associational analyses in nutritional epidemiology; a protocol that only optimises accuracy can mislead.</w:t>
       </w:r>
     </w:p>
     <w:p>
@@ -203,7 +203,7 @@
               <a:graphicData uri="http://schemas.openxmlformats.org/drawingml/2006/picture">
                 <pic:pic>
                   <pic:nvPicPr>
-                    <pic:cNvPr id="0" name="Fig1_framework_overview.png"/>
+                    <pic:cNvPr id="0" name="image.png"/>
                     <pic:cNvPicPr/>
                   </pic:nvPicPr>
                   <pic:blipFill>
@@ -1382,10 +1382,27 @@
     <w:bookmarkEnd w:id="2"/>
     <w:p>
       <w:pPr>
+        <w:spacing w:before="200" w:after="80"/>
+      </w:pPr>
+      <w:r>
+        <w:rPr>
+          <w:b/>
+        </w:rPr>
+        <w:t>Missing Data Mechanisms and Simulation</w:t>
+      </w:r>
+    </w:p>
+    <w:p>
+      <w:pPr>
         <w:spacing w:after="120"/>
       </w:pPr>
       <w:r>
-        <w:t>Primary evaluations masked contextual labels completely at random (MCAR) among observations with known labels in the held-out test set. Supplementary analyses simulated MAR missingness (probability of missingness increasing with fat energy ratio) and spatially structured missingness. Under MAR, proposed accuracy was 0.765 compared with 0.786 under MCAR, indicating modest sensitivity to departures from MCAR. Results should be interpreted conditional on the assumption that dietary features remain observed when contextual labels are missing.</w:t>
+        <w:t>MCAR. On the held-out test set, each observation's contextual label is masked independently with probability π = 0.30 (primary scenario; robustness also uses π ∈ {0.10,…,0.70}). Masking is independent of covariates and of the true label. Predictors remain fully observed.</w:t>
+        <w:br/>
+        <w:br/>
+        <w:t>MAR. We generate missingness depending on observed FatER via a logistic propensity model: logit{P(R=1 | FatER)} = β₀ + β₁ z(FatER), where z(FatER) is the standardised FatER on the test set, β₁ = 2.0, and β₀ is calibrated so that E[P(R=1)] ≈ 0.30 (fitted β₀ = -1.354; realised rate 0.300). Larger FatER therefore increases the probability of label missingness, approximating settings where more urbanised dietary profiles are differentially incomplete.</w:t>
+        <w:br/>
+        <w:br/>
+        <w:t>Spatially structured missingness. Labels are masked at the observation level with province-specific rates: 0.50 in Beijing, Shanghai, and Chongqing and 0.20 elsewhere (not whole-province deletion). This sensitivity check is reported alongside MCAR/MAR; primary conclusions rely on MCAR with MAR as the main departure-from-randomness stress test.</w:t>
       </w:r>
     </w:p>
     <w:p>
@@ -6776,6 +6793,22 @@
       </w:pPr>
       <w:r>
         <w:t>Probability threshold tuning. Because default argmax classification under-represents Urban labels, we evaluated lower decision thresholds on predicted Urban probability. At an Urban threshold of 0.35, masked-label Urban recall increased to 0.66 (overall accuracy 0.750); at 0.40, Urban recall was 0.58 with accuracy 0.766 and Rural recall 0.76 (Supplementary Table S8). This supports application-specific threshold selection rather than a single deterministic rule.</w:t>
+      </w:r>
+    </w:p>
+    <w:p>
+      <w:pPr>
+        <w:spacing w:after="120"/>
+      </w:pPr>
+      <w:r>
+        <w:t>Under the explicit mechanisms above, proposed accuracy was 0.786 (MCAR), 0.709 (MAR), and 0.779 (spatial rates). The larger drop under MAR indicates sensitivity when missingness tracks FatER—the same feature that enters prediction—reinforcing reporting of mechanism parameters rather than MCAR-only claims.</w:t>
+      </w:r>
+    </w:p>
+    <w:p>
+      <w:pPr>
+        <w:spacing w:after="120"/>
+      </w:pPr>
+      <w:r>
+        <w:t>Threshold fragility of the three-class descriptive labels. Varying the transitional FatER band changed three-class accuracy sharply: under the default band [0.23, 0.30] accuracy was 0.782, whereas widening to [0.25, 0.32] reduced accuracy to 0.679 (Supplementary Table S9). This instability shows that hard thresholds on a predictor used to define an outcome render multi-class accuracy an unreliable headline metric. Accordingly, primary conclusions rest on the binary T2 Rural/Urban task (masked accuracy 0.716; Supplementary Table S7).</w:t>
       </w:r>
     </w:p>
     <w:p>
@@ -6929,7 +6962,7 @@
         </w:rPr>
       </w:pPr>
       <w:r>
-        <w:t>Distributional agreement between observed and inferred category proportions was acceptable. Jensen–Shannon divergence remained below 0.00022 at 70% missingness, and maximum category proportion deviation was 0.02% at 50% missingness (Table 5).</w:t>
+        <w:t>Jensen–Shannon divergence summarises agreement between observed and imputed category marginals. JS → 0 is necessary but not sufficient for faithful recovery: marginal balance can hold while year–region–category joints remain distorted (e.g., the urban share in a specific wave). We therefore treat low JS as a screening criterion and rely on temporal/spatial holdouts and downstream regressions to probe joint structure beyond margins.</w:t>
       </w:r>
     </w:p>
     <w:p>
@@ -9519,7 +9552,7 @@
         </w:rPr>
       </w:pPr>
       <w:r>
-        <w:t>Predicted probabilities were reasonably calibrated across categories (Figure 4). Expected calibration error was below 0.01 for all categories, and Brier scores indicated good agreement between predicted and observed outcomes (Table 7).</w:t>
+        <w:t>Calibration is evaluated because well-calibrated class probabilities are not merely a goodness-of-fit summary: they can be used as inverse-probability weights or as draws in multiple imputation for downstream sensitivity analyses when labels are missing. We therefore report Brier scores and expected calibration error (ECE) and interpret calibration as a prerequisite for probability-based reuse of imputed labels, not only as a classifier diagnostic.</w:t>
       </w:r>
     </w:p>
     <w:p>
@@ -10437,7 +10470,7 @@
         </w:rPr>
       </w:pPr>
       <w:r>
-        <w:t>Analyses using inferred labels preserved the direction and statistical significance of urban–rural differences across all dietary indicators (Table 8; Figure 5). Cohen's d was moderately inflated (25% relative increase on average) when using inferred labels, because Transitional observations were assigned to Rural or Urban groups, sharpening group contrasts. Statistical significance was preserved in all cases; inferred labels are better suited to descriptive comparisons or covariate adjustment than standalone effect estimation.</w:t>
+        <w:t>Analyses using imputed labels preserved the direction and statistical significance of urban–rural differences across all dietary indicators (Table 8; Figure 5). Cohen's d was moderately inflated (25% relative increase on average) when using imputed labels, because Transitional observations were assigned to Rural or Urban groups, sharpening group contrasts. Statistical significance was preserved in all cases; imputed labels are better suited to descriptive comparisons or covariate adjustment than standalone effect estimation.</w:t>
       </w:r>
     </w:p>
     <w:p>
@@ -11624,32 +11657,15 @@
         </w:rPr>
       </w:pPr>
       <w:r>
-        <w:rPr>
-          <w:rFonts w:ascii="Times New Roman" w:hAnsi="Times New Roman" w:cs="Times New Roman"/>
-          <w:b/>
-          <w:bCs/>
-        </w:rPr>
-        <w:t>Figure 5.</w:t>
-      </w:r>
-      <w:r>
-        <w:rPr>
-          <w:rFonts w:ascii="Times New Roman" w:hAnsi="Times New Roman" w:cs="Times New Roman"/>
-        </w:rPr>
-        <w:t> Downstream epidemiological bias assessment under 30% simulated missingness. Comparison of urban–rural effect sizes (Cohen's </w:t>
-      </w:r>
-      <w:r>
-        <w:rPr>
-          <w:rFonts w:ascii="Times New Roman" w:hAnsi="Times New Roman" w:cs="Times New Roman"/>
-          <w:i/>
-          <w:iCs/>
-        </w:rPr>
-        <w:t>d</w:t>
-      </w:r>
-      <w:r>
-        <w:rPr>
-          <w:rFonts w:ascii="Times New Roman" w:hAnsi="Times New Roman" w:cs="Times New Roman"/>
-        </w:rPr>
-        <w:t>) computed using true labels versus inferred labels for four macronutrient features. Error bars represent 95% confidence intervals from bootstrap resampling (n = 2,000).</w:t>
+        <w:t>Figure 5. Downstream epidemiological bias assessment under 30% simulated missingness. Comparison of urban–rural effect sizes (Cohen's d) computed using true labels versus imputed labels for four macronutrient features. Error bars represent 95% confidence intervals from bootstrap resampling (n = 2,000).</w:t>
+      </w:r>
+    </w:p>
+    <w:p>
+      <w:pPr>
+        <w:spacing w:after="120"/>
+      </w:pPr>
+      <w:r>
+        <w:t>Covariate-adjusted downstream preservation. Beyond unadjusted Cohen's d, we fit OLS models of each macronutrient outcome on Urban versus Rural status, adjusting for survey year and province indicators (age and sex are unavailable in this diet-file extract). Under 30% MCAR masking, the Urban coefficient for FatER changed from 0.0697 (SE 0.0020) with true labels to 0.0869 (SE 0.0020) with imputed labels (relative change 24.6%), with sign and statistical significance preserved (Supplementary Table S10). This adjusted contrast is closer to applied epidemiological practice than unadjusted mean differences alone.</w:t>
       </w:r>
     </w:p>
     <w:p>
@@ -11677,63 +11693,17 @@
         </w:rPr>
       </w:pPr>
       <w:r>
-        <w:rPr>
-          <w:rFonts w:ascii="Times New Roman" w:hAnsi="Times New Roman" w:cs="Times New Roman"/>
-        </w:rPr>
-        <w:lastRenderedPageBreak/>
-        <w:t>Feature importance analysis showed that multiple macronutrient indicators contributed to classification (</w:t>
-      </w:r>
-      <w:r>
-        <w:rPr>
-          <w:rFonts w:ascii="Times New Roman" w:hAnsi="Times New Roman" w:cs="Times New Roman"/>
-          <w:b/>
-          <w:bCs/>
-        </w:rPr>
-        <w:t>Supplementary Table S1</w:t>
-      </w:r>
-      <w:r>
-        <w:rPr>
-          <w:rFonts w:ascii="Times New Roman" w:hAnsi="Times New Roman" w:cs="Times New Roman"/>
-        </w:rPr>
-        <w:t>), with fat energy ratio being the most influential (mean |SHAP| = 0.554), followed by carbohydrate energy ratio (0.148) and protein energy ratio (0.144). The SHAP summary plot illustrates the directional effects of each feature on Urban classification (</w:t>
-      </w:r>
-      <w:r>
-        <w:rPr>
-          <w:rFonts w:ascii="Times New Roman" w:hAnsi="Times New Roman" w:cs="Times New Roman"/>
-          <w:b/>
-          <w:bCs/>
-        </w:rPr>
-        <w:t>Supplementary Figure S1</w:t>
-      </w:r>
-      <w:r>
-        <w:rPr>
-          <w:rFonts w:ascii="Times New Roman" w:hAnsi="Times New Roman" w:cs="Times New Roman"/>
-        </w:rPr>
-        <w:t xml:space="preserve">). Interaction analysis revealed that 19.8% of the framework's predictive power derived from pairwise feature interactions, with the strongest interaction between fat and carbohydrate energy ratios (interaction strength = 0.051; </w:t>
-      </w:r>
-      <w:r>
-        <w:rPr>
-          <w:rFonts w:ascii="Times New Roman" w:hAnsi="Times New Roman" w:cs="Times New Roman"/>
-          <w:b/>
-          <w:bCs/>
-        </w:rPr>
-        <w:t>Supplementary Table S2</w:t>
-      </w:r>
-      <w:r>
-        <w:rPr>
-          <w:rFonts w:ascii="Times New Roman" w:hAnsi="Times New Roman" w:cs="Times New Roman"/>
-        </w:rPr>
-        <w:t>).</w:t>
-      </w:r>
-    </w:p>
-    <w:p>
-      <w:pPr>
-        <w:rPr>
-          <w:rFonts w:ascii="Times New Roman" w:hAnsi="Times New Roman" w:cs="Times New Roman"/>
-        </w:rPr>
-      </w:pPr>
-      <w:r>
-        <w:t>Leave-one-province-out validation demonstrated spatial generalisability, with mean accuracy 0.737 (SD 0.052) across provinces (Supplementary Table S3). Category-specific accuracy remained stable across missing rates (Supplementary Table S5).</w:t>
+        <w:t>Feature importance analysis showed that multiple macronutrient indicators contributed to classification (Supplementary Table S1), with fat energy ratio being the most influential (mean |SHAP| = 0.512), followed by carbohydrate energy ratio (0.166) and protein energy ratio (0.140). The SHAP summary plot illustrates the directional effects of each feature on Urban classification (Supplementary Figure S1). Interaction analysis revealed substantial pairwise contributions, with the strongest interaction between fat and carbohydrate energy ratios (interaction strength = 0.051; Supplementary Table S2).</w:t>
+      </w:r>
+    </w:p>
+    <w:p>
+      <w:pPr>
+        <w:rPr>
+          <w:rFonts w:ascii="Times New Roman" w:hAnsi="Times New Roman" w:cs="Times New Roman"/>
+        </w:rPr>
+      </w:pPr>
+      <w:r>
+        <w:t>Leave-one-province-out validation demonstrated spatial generalisability, with mean accuracy 0.737 (SD 0.052) across provinces (Supplementary Table S3). Rural and Urban category-specific accuracy remained stable across missing rates (Rural ≈ 0.87–0.89; Urban ≈ 0.41–0.43; Supplementary Table S5); Transitional accuracy is omitted from Table S5 because of partial definitional overlap with FatER.</w:t>
       </w:r>
     </w:p>
     <w:p>
@@ -11759,16 +11729,6 @@
         </w:rPr>
       </w:pPr>
       <w:r>
-        <w:t>Leave-one-province-out validation demonstrated spatial generalisability, with mean accuracy 0.737 (SD 0.052) across provinces (Supplementary Table S3). Category-specific accuracy remained stable across missing rates (Supplementary Table S5).</w:t>
-      </w:r>
-    </w:p>
-    <w:p>
-      <w:pPr>
-        <w:rPr>
-          <w:rFonts w:ascii="Times New Roman" w:hAnsi="Times New Roman" w:cs="Times New Roman"/>
-        </w:rPr>
-      </w:pPr>
-      <w:r>
         <w:t>Three findings are particularly relevant for methodological applications in survey statistics.</w:t>
       </w:r>
     </w:p>
@@ -11850,6 +11810,14 @@
     </w:p>
     <w:p>
       <w:pPr>
+        <w:spacing w:after="120"/>
+      </w:pPr>
+      <w:r>
+        <w:t>Protocol application guide. Researchers adapting this blueprint to another survey should: (i) choose a reference cohort with complete contextual labels for internal validation; (ii) specify MCAR masking rates matching expected incompleteness and at least one MAR mechanism tied to observed covariates with reported propensity coefficients; (iii) pre-declare a primary estimand that is not defined by the same features used as predictors (prefer administrative or external labels for the primary task); (iv) evaluate both predictive metrics and at least one downstream target parameter (e.g., an adjusted exposure coefficient) under true versus imputed labels; (v) assess temporal and/or spatial holdout generalisability; and (vi) report calibration if probabilities will be reused as weights or multiple-imputation draws. Hyperparameters and comparator imputation methods can be swapped without changing the protocol skeleton.</w:t>
+      </w:r>
+    </w:p>
+    <w:p>
+      <w:pPr>
         <w:pStyle w:val="3"/>
       </w:pPr>
       <w:r>
@@ -11878,7 +11846,7 @@
         </w:rPr>
       </w:pPr>
       <w:r>
-        <w:t>Several limitations should be considered. First, CHNS 1991–2011 is a single-country illustrative example; LOYO ending in 2011 limits claims about future-wave transportability without retraining. Second, the three-category definition is threshold-dependent; transitional-band sensitivity analyses are reported in Supplementary Material. Third, short-term 24-hour recalls may not fully reflect habitual intake. Fourth, inferred labels are probabilistic proxies, not administrative substitutes. Fifth, because FatER defines labels and is a predictor, overall accuracy can be inflated by definitional overlap; ablation excluding FatER and category-specific interpretation are therefore essential.</w:t>
+        <w:t>Several limitations should be considered. First, CHNS 1991–2011 is a single-country illustrative example; LOYO ending in 2011 limits claims about future-wave transportability without retraining. Second, the three-category structure combines administrative T2 labels with a FatER-defined transitional overlay; band sensitivity is reported in Supplementary Table S9, and primary conclusions rely on the binary Rural/Urban task (Supplementary Table S7). Third, short-term 24-hour recalls may not fully reflect habitual intake. Fourth, imputed labels are probabilistic proxies, not administrative substitutes.</w:t>
       </w:r>
     </w:p>
     <w:p>
@@ -11933,6 +11901,14 @@
       </w:pPr>
       <w:r>
         <w:t>Future Directions</w:t>
+      </w:r>
+    </w:p>
+    <w:p>
+      <w:pPr>
+        <w:spacing w:after="120"/>
+      </w:pPr>
+      <w:r>
+        <w:t>Code and data availability. Analysis scripts that regenerate all main and supplementary tables (including Table S9 band sensitivity and Table S10 adjusted regressions) are provided at https://github.com/tyrone1979/nutri2-urban.</w:t>
       </w:r>
     </w:p>
     <w:p>

</xml_diff>